<commit_message>
feat: combined offer - per-equipment itemised Scope of Supply (full BOM)
Each equipment's full BOM now drives Annexure I Scope of Supply: an
equipment header row + numbered item lines (item - ref, qty, make).
- Embedded forms now include 'make' in the captured BOM.
- Builder sends each equipment's BOM in the generate-offer payload.
- Endpoint builds scope_rows; & < > escaped (docxtpl wasn't escaping, so
  makes like L&T were truncated).
- Build script: price schedule rebuilt BEFORE the scope fill to avoid the
  'Item Description' header detection colliding.
Verified: scope lists every BOM item per equipment; L&T / AUDCO/L&T/LEADER
render correctly; price schedule + adjustments intact; no leftover tags.

Co-Authored-By: Claude Opus 4.8 (1M context) <noreply@anthropic.com>
</commit_message>
<xml_diff>
--- a/Combined_Offer_Template.docx
+++ b/Combined_Offer_Template.docx
@@ -2981,6 +2981,7 @@
       </w:tblGrid>
       <w:tr>
         <w:trPr>
+          <w:trHeight w:val="397" w:hRule="atLeast"/>
           <w:tblHeader/>
         </w:trPr>
         <w:tc>
@@ -3003,20 +3004,8 @@
             <w:vAlign w:val="center"/>
           </w:tcPr>
           <w:p>
-            <w:pPr>
-              <w:spacing w:after="40" w:before="40"/>
-              <w:jc w:val="center"/>
-            </w:pPr>
-            <w:r>
-              <w:rPr>
-                <w:rFonts w:ascii="Calibri" w:cs="Calibri" w:eastAsia="Calibri" w:hAnsi="Calibri"/>
-                <w:b/>
-                <w:bCs/>
-                <w:color w:val="FFFFFF"/>
-                <w:sz w:val="22"/>
-                <w:szCs w:val="22"/>
-              </w:rPr>
-              <w:t xml:space="preserve">S. No.</w:t>
+            <w:r>
+              <w:t>Item Description</w:t>
             </w:r>
           </w:p>
         </w:tc>
@@ -3028,7 +3017,7 @@
           </w:tcPr>
           <w:p>
             <w:r>
-              <w:t>{%tr for eq in equipments %}</w:t>
+              <w:t>{%tr for r in scope_rows %}</w:t>
             </w:r>
           </w:p>
         </w:tc>
@@ -3042,13 +3031,16 @@
         </w:tc>
       </w:tr>
       <w:tr>
+        <w:trPr>
+          <w:trHeight w:val="397" w:hRule="atLeast"/>
+        </w:trPr>
         <w:tc>
           <w:tcPr>
             <w:tcW w:type="dxa" w:w="900"/>
           </w:tcPr>
           <w:p>
             <w:r>
-              <w:t>{{ loop.index }}.</w:t>
+              <w:t>{{ r.sno }}</w:t>
             </w:r>
           </w:p>
         </w:tc>
@@ -3058,7 +3050,7 @@
           </w:tcPr>
           <w:p>
             <w:r>
-              <w:t>{{ eq.name }}</w:t>
+              <w:t>{{ r.desc }}</w:t>
             </w:r>
           </w:p>
         </w:tc>

</xml_diff>

<commit_message>
feat: combined offer tech specs side-by-side (column per equipment)
Technical Specifications now compares equipment side by side: parameters down
the left, one column per equipment with the equipment name as the heading.
Built directly with python-docx after rendering (dynamic column count), since
docxtpl can't express a variable number of table columns. Template keeps a
'Parameter | Specification' placeholder the endpoint expands in place (so it
keeps the table style/header shading).
</commit_message>
<xml_diff>
--- a/Combined_Offer_Template.docx
+++ b/Combined_Offer_Template.docx
@@ -2853,68 +2853,6 @@
               </w:rPr>
               <w:t>Specification</w:t>
             </w:r>
-          </w:p>
-        </w:tc>
-      </w:tr>
-      <w:tr>
-        <w:tc>
-          <w:tcPr>
-            <w:tcW w:type="dxa" w:w="3744"/>
-          </w:tcPr>
-          <w:p>
-            <w:r>
-              <w:t>{%tr for r in tech_rows %}</w:t>
-            </w:r>
-          </w:p>
-        </w:tc>
-        <w:tc>
-          <w:tcPr>
-            <w:tcW w:type="dxa" w:w="5616"/>
-          </w:tcPr>
-          <w:p>
-            <w:r/>
-          </w:p>
-        </w:tc>
-      </w:tr>
-      <w:tr>
-        <w:tc>
-          <w:tcPr>
-            <w:tcW w:type="dxa" w:w="3744"/>
-          </w:tcPr>
-          <w:p>
-            <w:r>
-              <w:t>{{ r.label }}</w:t>
-            </w:r>
-          </w:p>
-        </w:tc>
-        <w:tc>
-          <w:tcPr>
-            <w:tcW w:type="dxa" w:w="5616"/>
-          </w:tcPr>
-          <w:p>
-            <w:r>
-              <w:t>{{ r.value }}</w:t>
-            </w:r>
-          </w:p>
-        </w:tc>
-      </w:tr>
-      <w:tr>
-        <w:tc>
-          <w:tcPr>
-            <w:tcW w:type="dxa" w:w="3744"/>
-          </w:tcPr>
-          <w:p>
-            <w:r>
-              <w:t>{%tr endfor %}</w:t>
-            </w:r>
-          </w:p>
-        </w:tc>
-        <w:tc>
-          <w:tcPr>
-            <w:tcW w:type="dxa" w:w="5616"/>
-          </w:tcPr>
-          <w:p>
-            <w:r/>
           </w:p>
         </w:tc>
       </w:tr>

</xml_diff>

<commit_message>
feat: remove Make List (Annexure VI) from combined offer
Combined offer no longer includes the Make List annexure (heading, table and
its List-of-Annexures row) via _remove_annexure_section. Annexures now I-V.
</commit_message>
<xml_diff>
--- a/Combined_Offer_Template.docx
+++ b/Combined_Offer_Template.docx
@@ -1714,112 +1714,6 @@
           </w:p>
         </w:tc>
       </w:tr>
-      <w:tr>
-        <w:tc>
-          <w:tcPr>
-            <w:tcW w:type="dxa" w:w="1800"/>
-            <w:tcBorders>
-              <w:top w:val="single" w:color="BFBFBF" w:sz="4"/>
-              <w:left w:val="single" w:color="BFBFBF" w:sz="4"/>
-              <w:bottom w:val="single" w:color="BFBFBF" w:sz="4"/>
-              <w:right w:val="single" w:color="BFBFBF" w:sz="4"/>
-            </w:tcBorders>
-            <w:shd w:fill="FFFFFF" w:val="clear"/>
-            <w:tcMar>
-              <w:top w:type="dxa" w:w="100"/>
-              <w:left w:type="dxa" w:w="140"/>
-              <w:bottom w:type="dxa" w:w="100"/>
-              <w:right w:type="dxa" w:w="140"/>
-            </w:tcMar>
-            <w:vAlign w:val="center"/>
-          </w:tcPr>
-          <w:p>
-            <w:pPr>
-              <w:spacing w:after="40" w:before="40"/>
-              <w:jc w:val="center"/>
-            </w:pPr>
-            <w:r>
-              <w:rPr>
-                <w:rFonts w:ascii="Calibri" w:cs="Calibri" w:eastAsia="Calibri" w:hAnsi="Calibri"/>
-                <w:b/>
-                <w:bCs/>
-                <w:sz w:val="22"/>
-                <w:szCs w:val="22"/>
-              </w:rPr>
-              <w:t xml:space="preserve">Annexure VI</w:t>
-            </w:r>
-          </w:p>
-        </w:tc>
-        <w:tc>
-          <w:tcPr>
-            <w:tcW w:type="dxa" w:w="5760"/>
-            <w:tcBorders>
-              <w:top w:val="single" w:color="BFBFBF" w:sz="4"/>
-              <w:left w:val="single" w:color="BFBFBF" w:sz="4"/>
-              <w:bottom w:val="single" w:color="BFBFBF" w:sz="4"/>
-              <w:right w:val="single" w:color="BFBFBF" w:sz="4"/>
-            </w:tcBorders>
-            <w:shd w:fill="FFFFFF" w:val="clear"/>
-            <w:tcMar>
-              <w:top w:type="dxa" w:w="100"/>
-              <w:left w:type="dxa" w:w="140"/>
-              <w:bottom w:type="dxa" w:w="100"/>
-              <w:right w:type="dxa" w:w="140"/>
-            </w:tcMar>
-            <w:vAlign w:val="center"/>
-          </w:tcPr>
-          <w:p>
-            <w:pPr>
-              <w:spacing w:after="40" w:before="40"/>
-              <w:jc w:val="left"/>
-            </w:pPr>
-            <w:r>
-              <w:rPr>
-                <w:rFonts w:ascii="Calibri" w:cs="Calibri" w:eastAsia="Calibri" w:hAnsi="Calibri"/>
-                <w:sz w:val="22"/>
-                <w:szCs w:val="22"/>
-              </w:rPr>
-              <w:t xml:space="preserve">Make List</w:t>
-            </w:r>
-          </w:p>
-        </w:tc>
-        <w:tc>
-          <w:tcPr>
-            <w:tcW w:type="dxa" w:w="1800"/>
-            <w:tcBorders>
-              <w:top w:val="single" w:color="BFBFBF" w:sz="4"/>
-              <w:left w:val="single" w:color="BFBFBF" w:sz="4"/>
-              <w:bottom w:val="single" w:color="BFBFBF" w:sz="4"/>
-              <w:right w:val="single" w:color="BFBFBF" w:sz="4"/>
-            </w:tcBorders>
-            <w:shd w:fill="FFFFFF" w:val="clear"/>
-            <w:tcMar>
-              <w:top w:type="dxa" w:w="100"/>
-              <w:left w:type="dxa" w:w="140"/>
-              <w:bottom w:type="dxa" w:w="100"/>
-              <w:right w:type="dxa" w:w="140"/>
-            </w:tcMar>
-            <w:vAlign w:val="center"/>
-          </w:tcPr>
-          <w:p>
-            <w:pPr>
-              <w:spacing w:after="40" w:before="40"/>
-              <w:jc w:val="center"/>
-            </w:pPr>
-            <w:r>
-              <w:rPr>
-                <w:rFonts w:ascii="Calibri" w:cs="Calibri" w:eastAsia="Calibri" w:hAnsi="Calibri"/>
-                <w:b/>
-                <w:bCs/>
-                <w:color w:val="4CAF50"/>
-                <w:sz w:val="22"/>
-                <w:szCs w:val="22"/>
-              </w:rPr>
-              <w:t xml:space="preserve">Attached</w:t>
-            </w:r>
-          </w:p>
-        </w:tc>
-      </w:tr>
     </w:tbl>
     <w:p>
       <w:r>
@@ -10626,194 +10520,6 @@
         </w:tc>
       </w:tr>
     </w:tbl>
-    <w:p>
-      <w:pPr>
-        <w:pStyle w:val="Heading1"/>
-        <w:pBdr>
-          <w:bottom w:val="single" w:color="E87722" w:sz="12" w:space="4"/>
-        </w:pBdr>
-        <w:spacing w:after="200" w:before="360"/>
-      </w:pPr>
-      <w:r>
-        <w:rPr>
-          <w:rFonts w:ascii="Calibri" w:cs="Calibri" w:eastAsia="Calibri" w:hAnsi="Calibri"/>
-          <w:b/>
-          <w:bCs/>
-          <w:color w:val="1F2937"/>
-          <w:sz w:val="32"/>
-          <w:szCs w:val="32"/>
-        </w:rPr>
-        <w:t>ANNEXURE VI — MAKE LIST</w:t>
-      </w:r>
-    </w:p>
-    <w:p>
-      <w:pPr>
-        <w:spacing w:after="160" w:before="60" w:line="300"/>
-        <w:jc w:val="left"/>
-      </w:pPr>
-      <w:r>
-        <w:rPr>
-          <w:rFonts w:ascii="Calibri" w:cs="Calibri" w:eastAsia="Calibri" w:hAnsi="Calibri"/>
-        </w:rPr>
-        <w:t xml:space="preserve">The following table lists the approved makes for major bought-out components in the proposed system.</w:t>
-      </w:r>
-    </w:p>
-    <w:tbl>
-      <w:tblPr>
-        <w:tblW w:type="dxa" w:w="9360"/>
-        <w:tblBorders>
-          <w:top w:val="single" w:color="auto" w:sz="4"/>
-          <w:left w:val="single" w:color="auto" w:sz="4"/>
-          <w:bottom w:val="single" w:color="auto" w:sz="4"/>
-          <w:right w:val="single" w:color="auto" w:sz="4"/>
-          <w:insideH w:val="single" w:color="auto" w:sz="4"/>
-          <w:insideV w:val="single" w:color="auto" w:sz="4"/>
-        </w:tblBorders>
-      </w:tblPr>
-      <w:tblGrid>
-        <w:gridCol w:w="780"/>
-        <w:gridCol w:w="4880"/>
-        <w:gridCol w:w="3700"/>
-      </w:tblGrid>
-      <w:tr>
-        <w:trPr>
-          <w:tblHeader/>
-        </w:trPr>
-        <w:tc>
-          <w:tcPr>
-            <w:tcW w:type="dxa" w:w="780"/>
-            <w:tcBorders>
-              <w:top w:val="single" w:color="BFBFBF" w:sz="4"/>
-              <w:left w:val="single" w:color="BFBFBF" w:sz="4"/>
-              <w:bottom w:val="single" w:color="BFBFBF" w:sz="4"/>
-              <w:right w:val="single" w:color="BFBFBF" w:sz="4"/>
-            </w:tcBorders>
-            <w:shd w:fill="E87722" w:val="clear"/>
-            <w:tcMar>
-              <w:top w:type="dxa" w:w="100"/>
-              <w:left w:type="dxa" w:w="140"/>
-              <w:bottom w:type="dxa" w:w="100"/>
-              <w:right w:type="dxa" w:w="140"/>
-            </w:tcMar>
-            <w:vAlign w:val="center"/>
-          </w:tcPr>
-          <w:p>
-            <w:pPr>
-              <w:spacing w:after="40" w:before="40"/>
-              <w:jc w:val="center"/>
-            </w:pPr>
-            <w:r>
-              <w:rPr>
-                <w:rFonts w:ascii="Calibri" w:cs="Calibri" w:eastAsia="Calibri" w:hAnsi="Calibri"/>
-                <w:b/>
-                <w:bCs/>
-                <w:color w:val="FFFFFF"/>
-                <w:sz w:val="22"/>
-                <w:szCs w:val="22"/>
-              </w:rPr>
-              <w:t xml:space="preserve">S. No.</w:t>
-            </w:r>
-          </w:p>
-        </w:tc>
-        <w:tc>
-          <w:tcPr>
-            <w:tcW w:type="dxa" w:w="4880"/>
-            <w:tcBorders>
-              <w:top w:val="single" w:color="BFBFBF" w:sz="4"/>
-              <w:left w:val="single" w:color="BFBFBF" w:sz="4"/>
-              <w:bottom w:val="single" w:color="BFBFBF" w:sz="4"/>
-              <w:right w:val="single" w:color="BFBFBF" w:sz="4"/>
-            </w:tcBorders>
-            <w:shd w:fill="E87722" w:val="clear"/>
-            <w:tcMar>
-              <w:top w:type="dxa" w:w="100"/>
-              <w:left w:type="dxa" w:w="140"/>
-              <w:bottom w:type="dxa" w:w="100"/>
-              <w:right w:type="dxa" w:w="140"/>
-            </w:tcMar>
-            <w:vAlign w:val="center"/>
-          </w:tcPr>
-          <w:p>
-            <w:pPr>
-              <w:spacing w:after="40" w:before="40"/>
-              <w:jc w:val="left"/>
-            </w:pPr>
-            <w:r>
-              <w:rPr>
-                <w:rFonts w:ascii="Calibri" w:cs="Calibri" w:eastAsia="Calibri" w:hAnsi="Calibri"/>
-                <w:b/>
-                <w:bCs/>
-                <w:color w:val="FFFFFF"/>
-                <w:sz w:val="22"/>
-                <w:szCs w:val="22"/>
-              </w:rPr>
-              <w:t xml:space="preserve">Item</w:t>
-            </w:r>
-          </w:p>
-        </w:tc>
-        <w:tc>
-          <w:tcPr>
-            <w:tcW w:type="dxa" w:w="3700"/>
-            <w:tcBorders>
-              <w:top w:val="single" w:color="BFBFBF" w:sz="4"/>
-              <w:left w:val="single" w:color="BFBFBF" w:sz="4"/>
-              <w:bottom w:val="single" w:color="BFBFBF" w:sz="4"/>
-              <w:right w:val="single" w:color="BFBFBF" w:sz="4"/>
-            </w:tcBorders>
-            <w:shd w:fill="E87722" w:val="clear"/>
-            <w:tcMar>
-              <w:top w:type="dxa" w:w="100"/>
-              <w:left w:type="dxa" w:w="140"/>
-              <w:bottom w:type="dxa" w:w="100"/>
-              <w:right w:type="dxa" w:w="140"/>
-            </w:tcMar>
-            <w:vAlign w:val="center"/>
-          </w:tcPr>
-          <w:p>
-            <w:pPr>
-              <w:spacing w:after="40" w:before="40"/>
-              <w:jc w:val="left"/>
-            </w:pPr>
-            <w:r>
-              <w:rPr>
-                <w:rFonts w:ascii="Calibri" w:cs="Calibri" w:eastAsia="Calibri" w:hAnsi="Calibri"/>
-                <w:b/>
-                <w:bCs/>
-                <w:color w:val="FFFFFF"/>
-                <w:sz w:val="22"/>
-                <w:szCs w:val="22"/>
-              </w:rPr>
-              <w:t xml:space="preserve">Make</w:t>
-            </w:r>
-          </w:p>
-        </w:tc>
-      </w:tr>
-    </w:tbl>
-    <w:p>
-      <w:pPr>
-        <w:spacing w:after="240" w:before="240"/>
-      </w:pPr>
-      <w:r>
-        <w:t xml:space="preserve"/>
-      </w:r>
-    </w:p>
-    <w:p>
-      <w:pPr>
-        <w:spacing w:after="60" w:before="60" w:line="300"/>
-        <w:jc w:val="center"/>
-      </w:pPr>
-      <w:r>
-        <w:rPr>
-          <w:rFonts w:ascii="Calibri" w:cs="Calibri" w:eastAsia="Calibri" w:hAnsi="Calibri"/>
-          <w:i/>
-          <w:iCs/>
-          <w:color w:val="6B7280"/>
-          <w:sz w:val="20"/>
-          <w:szCs w:val="20"/>
-        </w:rPr>
-        <w:t xml:space="preserve">— End of Document —</w:t>
-      </w:r>
-    </w:p>
     <w:sectPr>
       <w:headerReference w:type="default" r:id="rId9"/>
       <w:footerReference w:type="default" r:id="rId10"/>

</xml_diff>